<commit_message>
Portal: dokumen 02 dan 04 Pusingan 42 (pembetulan gaya Borang Festival)
- 04 Borang Pertandingan (docx, pdf 36 muka): label kotak semak Borang 3 "Rakaman Sendiri" (12 bingkai), TABIKA KEMAS dalam Borang 4B, Borang 7 nota logo tanpa koma Oxford
- 02 Nota Kursus (pdf 248 muka): pembetulan yang sama dalam Lampiran 1; TABIKA huruf besar pada 16 tempat (jadual sebutan TTS kekal "Tabika" dengan sengaja)
Fail sama dengan 00_SEMASA selepas Pusingan 42 (MD5 02 pdf bb3c5c7e, 04 docx 0605538f, 04 pdf 84464a1a).

Co-Authored-By: Claude Opus 5.5 <noreply@anthropic.com>
Claude-Session: https://claude.ai/code/session_01B4ZXcZKZZemw5Hy6h3gC3G
</commit_message>
<xml_diff>
--- a/04_Borang_Pertandingan_CDKK.docx
+++ b/04_Borang_Pertandingan_CDKK.docx
@@ -13038,7 +13038,7 @@
                 <w:szCs w:val="17"/>
                 <w:lang w:val="ms-MY"/>
               </w:rPr>
-              <w:t xml:space="preserve"> Rakaman Sendiri.   </w:t>
+              <w:t xml:space="preserve"> Rakaman Sendiri   </w:t>
             </w:r>
             <w:sdt>
               <w:sdtPr>
@@ -13216,7 +13216,7 @@
                 <w:szCs w:val="17"/>
                 <w:lang w:val="ms-MY"/>
               </w:rPr>
-              <w:t xml:space="preserve"> Rakaman Sendiri.   </w:t>
+              <w:t xml:space="preserve"> Rakaman Sendiri   </w:t>
             </w:r>
             <w:sdt>
               <w:sdtPr>
@@ -14084,7 +14084,7 @@
                 <w:szCs w:val="17"/>
                 <w:lang w:val="ms-MY"/>
               </w:rPr>
-              <w:t xml:space="preserve"> Rakaman Sendiri.   </w:t>
+              <w:t xml:space="preserve"> Rakaman Sendiri   </w:t>
             </w:r>
             <w:sdt>
               <w:sdtPr>
@@ -14262,7 +14262,7 @@
                 <w:szCs w:val="17"/>
                 <w:lang w:val="ms-MY"/>
               </w:rPr>
-              <w:t xml:space="preserve"> Rakaman Sendiri.   </w:t>
+              <w:t xml:space="preserve"> Rakaman Sendiri   </w:t>
             </w:r>
             <w:sdt>
               <w:sdtPr>
@@ -15476,7 +15476,7 @@
                 <w:szCs w:val="17"/>
                 <w:lang w:val="ms-MY"/>
               </w:rPr>
-              <w:t xml:space="preserve"> Rakaman Sendiri.   </w:t>
+              <w:t xml:space="preserve"> Rakaman Sendiri   </w:t>
             </w:r>
             <w:sdt>
               <w:sdtPr>
@@ -15654,7 +15654,7 @@
                 <w:szCs w:val="17"/>
                 <w:lang w:val="ms-MY"/>
               </w:rPr>
-              <w:t xml:space="preserve"> Rakaman Sendiri.   </w:t>
+              <w:t xml:space="preserve"> Rakaman Sendiri   </w:t>
             </w:r>
             <w:sdt>
               <w:sdtPr>
@@ -16522,7 +16522,7 @@
                 <w:szCs w:val="17"/>
                 <w:lang w:val="ms-MY"/>
               </w:rPr>
-              <w:t xml:space="preserve"> Rakaman Sendiri.   </w:t>
+              <w:t xml:space="preserve"> Rakaman Sendiri   </w:t>
             </w:r>
             <w:sdt>
               <w:sdtPr>
@@ -16700,7 +16700,7 @@
                 <w:szCs w:val="17"/>
                 <w:lang w:val="ms-MY"/>
               </w:rPr>
-              <w:t xml:space="preserve"> Rakaman Sendiri.   </w:t>
+              <w:t xml:space="preserve"> Rakaman Sendiri   </w:t>
             </w:r>
             <w:sdt>
               <w:sdtPr>
@@ -17914,7 +17914,7 @@
                 <w:szCs w:val="17"/>
                 <w:lang w:val="ms-MY"/>
               </w:rPr>
-              <w:t xml:space="preserve"> Rakaman Sendiri.   </w:t>
+              <w:t xml:space="preserve"> Rakaman Sendiri   </w:t>
             </w:r>
             <w:sdt>
               <w:sdtPr>
@@ -18092,7 +18092,7 @@
                 <w:szCs w:val="17"/>
                 <w:lang w:val="ms-MY"/>
               </w:rPr>
-              <w:t xml:space="preserve"> Rakaman Sendiri.   </w:t>
+              <w:t xml:space="preserve"> Rakaman Sendiri   </w:t>
             </w:r>
             <w:sdt>
               <w:sdtPr>
@@ -18960,7 +18960,7 @@
                 <w:szCs w:val="17"/>
                 <w:lang w:val="ms-MY"/>
               </w:rPr>
-              <w:t xml:space="preserve"> Rakaman Sendiri.   </w:t>
+              <w:t xml:space="preserve"> Rakaman Sendiri   </w:t>
             </w:r>
             <w:sdt>
               <w:sdtPr>
@@ -19138,7 +19138,7 @@
                 <w:szCs w:val="17"/>
                 <w:lang w:val="ms-MY"/>
               </w:rPr>
-              <w:t xml:space="preserve"> Rakaman Sendiri.   </w:t>
+              <w:t xml:space="preserve"> Rakaman Sendiri   </w:t>
             </w:r>
             <w:sdt>
               <w:sdtPr>
@@ -22180,7 +22180,7 @@
         <w:rPr>
           <w:lang w:val="ms-MY"/>
         </w:rPr>
-        <w:t>Varian bagi pasukan yang dicabut kategori Kanak-Kanak Alpha Gen Talents (AGT). Borang ini dilengkapkan pada hari pertandingan menerusi temu bual dengan guru Tabika KEMAS atau jurulatih yang mengesahkan aktiviti dan pencapaian peserta AGT berkenaan. Setiap angka yang dipaparkan dalam video hendaklah boleh dijejaki kepada borang ini. Skop fakta terhad kepada data aktiviti dan pencapaian peserta AGT di FESMA sahaja. Statistik dalam atau luar negara tidak diperlukan dan tidak diberi markah.</w:t>
+        <w:t>Varian bagi pasukan yang dicabut kategori Kanak-Kanak Alpha Gen Talents (AGT). Borang ini dilengkapkan pada hari pertandingan menerusi temu bual dengan guru TABIKA KEMAS atau jurulatih yang mengesahkan aktiviti dan pencapaian peserta AGT berkenaan. Setiap angka yang dipaparkan dalam video hendaklah boleh dijejaki kepada borang ini. Skop fakta terhad kepada data aktiviti dan pencapaian peserta AGT di FESMA sahaja. Statistik dalam atau luar negara tidak diperlukan dan tidak diberi markah.</w:t>
       </w:r>
     </w:p>
     <w:p>
@@ -22331,7 +22331,7 @@
               <w:rPr>
                 <w:lang w:val="ms-MY"/>
               </w:rPr>
-              <w:t>Jawatan Dan Nama Tabika KEMAS</w:t>
+              <w:t>Jawatan Dan Nama TABIKA KEMAS</w:t>
             </w:r>
           </w:p>
         </w:tc>
@@ -34251,7 +34251,7 @@
           <w:color w:val="6B7280"/>
           <w:lang w:val="ms-MY"/>
         </w:rPr>
-        <w:t>Nota: Fail logo hendaklah dalam format PNG berlatar lutsinar dengan saiz minimum 1000 piksel, jelas pada latar terang dan gelap, dan tidak meniru logo rasmi KEMAS atau jata negeri.</w:t>
+        <w:t>Nota: Fail logo hendaklah dalam format PNG berlatar lutsinar dengan saiz minimum 1000 piksel, jelas pada latar terang dan gelap serta tidak meniru logo rasmi KEMAS atau jata negeri.</w:t>
       </w:r>
     </w:p>
     <w:p>

</xml_diff>